<commit_message>
feat(plantillas,contratos): Courier New en todos los documentos + cláusulas adicionales por contrato
- Las 15 plantillas pasan a Courier New (styles, theme y fuentes explícitas)
- Nuevo punto {CLAUSULAS_ADICIONALES} antes de las firmas en los 10 contratos
- Campo "Cláusulas adicionales" en el formulario interno + edición desde el listado
  (lápiz, estados solicitado/generado; editar un aprobado lo devuelve a generado)
- Botón Regenerar para aplicar cambios al documento; se inserta como
  "CLÁUSULA ADICIONAL PACTADA: …" (vacío = no aparece)

Co-Authored-By: Claude Opus 4.8 <noreply@anthropic.com>
</commit_message>
<xml_diff>
--- a/app/plantillas/GENERICO/ANEXO Renovacion Plazo Fijo a Fijo.docx
+++ b/app/plantillas/GENERICO/ANEXO Renovacion Plazo Fijo a Fijo.docx
@@ -1414,7 +1414,7 @@
     </a:clrScheme>
     <a:fontScheme name="Office">
       <a:majorFont>
-        <a:latin typeface="Aptos Display" panose="02110004020202020204"/>
+        <a:latin typeface="Courier New" panose="02110004020202020204"/>
         <a:ea typeface=""/>
         <a:cs typeface=""/>
         <a:font script="Jpan" typeface="游ゴシック Light"/>
@@ -1466,7 +1466,7 @@
         <a:font script="Tfng" typeface="Ebrima"/>
       </a:majorFont>
       <a:minorFont>
-        <a:latin typeface="Aptos" panose="02110004020202020204"/>
+        <a:latin typeface="Courier New" panose="02110004020202020204"/>
         <a:ea typeface=""/>
         <a:cs typeface=""/>
         <a:font script="Jpan" typeface="游明朝"/>

</xml_diff>

<commit_message>
Anexo renovacion fijo a fijo: titulo centrado, comuna empresa y fecha del anexo
- Plantilla: titulo 'ANEXO DE RENOVACION PLAZO FIJO' centrado; literal
  (COMUNA EMPRESA) reemplazado por placeholder {COMUNA_EMPRESA}.
- Generador: rellena COMUNA_EMPRESA (comuna de la empresa) y usa la nueva
  columna contratos.anexo_fecha para la fecha del preambulo (si no, hoy).

Co-Authored-By: Claude Opus 4.8 <noreply@anthropic.com>
</commit_message>
<xml_diff>
--- a/app/plantillas/GENERICO/ANEXO Renovacion Plazo Fijo a Fijo.docx
+++ b/app/plantillas/GENERICO/ANEXO Renovacion Plazo Fijo a Fijo.docx
@@ -3,6 +3,9 @@
 <w:document xmlns:wpc="http://schemas.microsoft.com/office/word/2010/wordprocessingCanvas" xmlns:cx="http://schemas.microsoft.com/office/drawing/2014/chartex" xmlns:cx1="http://schemas.microsoft.com/office/drawing/2015/9/8/chartex" xmlns:cx2="http://schemas.microsoft.com/office/drawing/2015/10/21/chartex" xmlns:cx3="http://schemas.microsoft.com/office/drawing/2016/5/9/chartex" xmlns:cx4="http://schemas.microsoft.com/office/drawing/2016/5/10/chartex" xmlns:cx5="http://schemas.microsoft.com/office/drawing/2016/5/11/chartex" xmlns:cx6="http://schemas.microsoft.com/office/drawing/2016/5/12/chartex" xmlns:cx7="http://schemas.microsoft.com/office/drawing/2016/5/13/chartex" xmlns:cx8="http://schemas.microsoft.com/office/drawing/2016/5/14/chartex" xmlns:mc="http://schemas.openxmlformats.org/markup-compatibility/2006" xmlns:aink="http://schemas.microsoft.com/office/drawing/2016/ink" xmlns:am3d="http://schemas.microsoft.com/office/drawing/2017/model3d" xmlns:o="urn:schemas-microsoft-com:office:office" xmlns:oel="http://schemas.microsoft.com/office/2019/extlst" xmlns:r="http://schemas.openxmlformats.org/officeDocument/2006/relationships" xmlns:m="http://schemas.openxmlformats.org/officeDocument/2006/math" xmlns:v="urn:schemas-microsoft-com:vml" xmlns:wp14="http://schemas.microsoft.com/office/word/2010/wordprocessingDrawing" xmlns:wp="http://schemas.openxmlformats.org/drawingml/2006/wordprocessingDrawing" xmlns:w10="urn:schemas-microsoft-com:office:word" xmlns:w="http://schemas.openxmlformats.org/wordprocessingml/2006/main" xmlns:w14="http://schemas.microsoft.com/office/word/2010/wordml" xmlns:w15="http://schemas.microsoft.com/office/word/2012/wordml" xmlns:w16cex="http://schemas.microsoft.com/office/word/2018/wordml/cex" xmlns:w16cid="http://schemas.microsoft.com/office/word/2016/wordml/cid" xmlns:w16="http://schemas.microsoft.com/office/word/2018/wordml" xmlns:w16du="http://schemas.microsoft.com/office/word/2023/wordml/word16du" xmlns:w16sdtdh="http://schemas.microsoft.com/office/word/2020/wordml/sdtdatahash" xmlns:w16sdtfl="http://schemas.microsoft.com/office/word/2024/wordml/sdtformatlock" xmlns:w16se="http://schemas.microsoft.com/office/word/2015/wordml/symex" xmlns:wpg="http://schemas.microsoft.com/office/word/2010/wordprocessingGroup" xmlns:wpi="http://schemas.microsoft.com/office/word/2010/wordprocessingInk" xmlns:wne="http://schemas.microsoft.com/office/word/2006/wordml" xmlns:wps="http://schemas.microsoft.com/office/word/2010/wordprocessingShape" mc:Ignorable="w14 w15 w16se w16cid w16 w16cex w16sdtdh w16sdtfl w16du wp14">
   <w:body>
     <w:p>
+      <w:pPr>
+        <w:jc w:val="center"/>
+      </w:pPr>
       <w:r>
         <w:rPr>
           <w:b/>
@@ -27,7 +30,7 @@
         <w:rPr>
           <w:lang w:val="es-ES"/>
         </w:rPr>
-        <w:t>(COMUNA EMPRESA)</w:t>
+        <w:t>{COMUNA_EMPRESA}</w:t>
       </w:r>
       <w:r>
         <w:rPr>

</xml_diff>

<commit_message>
Anexo renovacion fijo a fijo: compactar a una hoja
Se eliminan 5 parrafos vacios (espaciadores de hoja completa, sobre todo el
bloque de 4 lineas en blanco antes de las firmas) que empujaban el documento
a una segunda pagina. Contenido, tabla de firmas y sectPr intactos.

Co-Authored-By: Claude Opus 4.8 <noreply@anthropic.com>
</commit_message>
<xml_diff>
--- a/app/plantillas/GENERICO/ANEXO Renovacion Plazo Fijo a Fijo.docx
+++ b/app/plantillas/GENERICO/ANEXO Renovacion Plazo Fijo a Fijo.docx
@@ -12,11 +12,6 @@
           <w:bCs/>
         </w:rPr>
         <w:t>ANEXO DE RENOVACIÓN PLAZO FIJO</w:t>
-      </w:r>
-    </w:p>
-    <w:p>
-      <w:r>
-        <w:t> </w:t>
       </w:r>
     </w:p>
     <w:p>
@@ -38,11 +33,6 @@
         </w:rPr>
         <w:t>, a {DA_CONTRATO}/{MA_CONTRATO}/{AAAA_CONTRATO}, entre {RAZON_SOCIAL},  Rol Único Tributario N.º {RUT_EMPRESA}, representada por don {NOMBRE_REP_LEGAL}, cédula nacional de identidad N.º{RUT_REP_LEGAL}, correo electrónico {EMAIL_EMPRESA}, todos con domicilio para estos efectos en {DIRECCION_EMPRESA}, en adelante “El Empleador”; y don {NOMBRE_EMPLEADO}, chileno, cédula nacional de identidad N.º {RUT_EMPLEADO}, correo electrónico {EMAILPERSONAL_EMPLEADO}, de nacionalidad {NACIONALIDAD_EMPLEADO}, con domicilio para estos efectos en {DIRECCION_EMPLEADO} en adelante “El Trabajador”, se ha convenido el siguiente anexo de renovación de contrato de trabajo:</w:t>
       </w:r>
-      <w:r>
-        <w:t> </w:t>
-      </w:r>
-    </w:p>
-    <w:p>
       <w:r>
         <w:t> </w:t>
       </w:r>
@@ -74,21 +64,6 @@
     <w:p>
       <w:r>
         <w:t>Para constancia y fe, firman las partes en dos ejemplares.</w:t>
-      </w:r>
-    </w:p>
-    <w:p>
-      <w:r>
-        <w:t> </w:t>
-      </w:r>
-    </w:p>
-    <w:p>
-      <w:r>
-        <w:t> </w:t>
-      </w:r>
-    </w:p>
-    <w:p>
-      <w:r>
-        <w:t> </w:t>
       </w:r>
     </w:p>
     <w:tbl>

</xml_diff>